<commit_message>
Add simulation files and project configuration for Vivado 2025.2
- Created new simulation files including glbl.sdb, xil_defaultlib.rlx, and xsim.version.
- Added xsim.ini for simulation settings.
- Initialized xlog and xpb files for logging simulation results.
- Established project configuration in w7.xpr with relevant settings for synthesis and implementation.
- Included source files and constraints for the design in the project structure.
</commit_message>
<xml_diff>
--- a/school/Lab_3_2026/Lab3_2026.docx
+++ b/school/Lab_3_2026/Lab3_2026.docx
@@ -176,6 +176,88 @@
           <w:szCs w:val="28"/>
         </w:rPr>
       </w:pPr>
+      <w:r>
+        <w:rPr>
+          <w:sz w:val="28"/>
+          <w:szCs w:val="28"/>
+        </w:rPr>
+        <w:drawing>
+          <wp:inline distT="0" distB="0" distL="0" distR="0" wp14:anchorId="516DF8C1" wp14:editId="2F3F1DFE">
+            <wp:extent cx="2878832" cy="1691376"/>
+            <wp:effectExtent l="0" t="0" r="0" b="4445"/>
+            <wp:docPr id="8" name="圖片 8"/>
+            <wp:cNvGraphicFramePr>
+              <a:graphicFrameLocks xmlns:a="http://schemas.openxmlformats.org/drawingml/2006/main" noChangeAspect="1"/>
+            </wp:cNvGraphicFramePr>
+            <a:graphic xmlns:a="http://schemas.openxmlformats.org/drawingml/2006/main">
+              <a:graphicData uri="http://schemas.openxmlformats.org/drawingml/2006/picture">
+                <pic:pic xmlns:pic="http://schemas.openxmlformats.org/drawingml/2006/picture">
+                  <pic:nvPicPr>
+                    <pic:cNvPr id="1" name=""/>
+                    <pic:cNvPicPr/>
+                  </pic:nvPicPr>
+                  <pic:blipFill>
+                    <a:blip r:embed="rId7"/>
+                    <a:stretch>
+                      <a:fillRect/>
+                    </a:stretch>
+                  </pic:blipFill>
+                  <pic:spPr>
+                    <a:xfrm>
+                      <a:off x="0" y="0"/>
+                      <a:ext cx="2885151" cy="1695089"/>
+                    </a:xfrm>
+                    <a:prstGeom prst="rect">
+                      <a:avLst/>
+                    </a:prstGeom>
+                  </pic:spPr>
+                </pic:pic>
+              </a:graphicData>
+            </a:graphic>
+          </wp:inline>
+        </w:drawing>
+      </w:r>
+      <w:r>
+        <w:rPr>
+          <w:sz w:val="28"/>
+          <w:szCs w:val="28"/>
+        </w:rPr>
+        <w:drawing>
+          <wp:inline distT="0" distB="0" distL="0" distR="0" wp14:anchorId="2AF1ACBC" wp14:editId="05E21888">
+            <wp:extent cx="2880790" cy="1692525"/>
+            <wp:effectExtent l="0" t="0" r="0" b="3175"/>
+            <wp:docPr id="11" name="圖片 11"/>
+            <wp:cNvGraphicFramePr>
+              <a:graphicFrameLocks xmlns:a="http://schemas.openxmlformats.org/drawingml/2006/main" noChangeAspect="1"/>
+            </wp:cNvGraphicFramePr>
+            <a:graphic xmlns:a="http://schemas.openxmlformats.org/drawingml/2006/main">
+              <a:graphicData uri="http://schemas.openxmlformats.org/drawingml/2006/picture">
+                <pic:pic xmlns:pic="http://schemas.openxmlformats.org/drawingml/2006/picture">
+                  <pic:nvPicPr>
+                    <pic:cNvPr id="1" name=""/>
+                    <pic:cNvPicPr/>
+                  </pic:nvPicPr>
+                  <pic:blipFill>
+                    <a:blip r:embed="rId8"/>
+                    <a:stretch>
+                      <a:fillRect/>
+                    </a:stretch>
+                  </pic:blipFill>
+                  <pic:spPr>
+                    <a:xfrm>
+                      <a:off x="0" y="0"/>
+                      <a:ext cx="2887197" cy="1696289"/>
+                    </a:xfrm>
+                    <a:prstGeom prst="rect">
+                      <a:avLst/>
+                    </a:prstGeom>
+                  </pic:spPr>
+                </pic:pic>
+              </a:graphicData>
+            </a:graphic>
+          </wp:inline>
+        </w:drawing>
+      </w:r>
     </w:p>
     <w:p>
       <w:pPr>
@@ -359,10 +441,10 @@
             <v:path o:extrusionok="f" gradientshapeok="t" o:connecttype="rect"/>
             <o:lock v:ext="edit" aspectratio="t"/>
           </v:shapetype>
-          <v:shape id="_x0000_i1025" type="#_x0000_t75" style="width:243.85pt;height:238.95pt" o:ole="">
-            <v:imagedata r:id="rId7" o:title=""/>
+          <v:shape id="_x0000_i1025" type="#_x0000_t75" style="width:243.9pt;height:238.9pt" o:ole="">
+            <v:imagedata r:id="rId9" o:title=""/>
           </v:shape>
-          <o:OLEObject Type="Embed" ProgID="Visio.Drawing.15" ShapeID="_x0000_i1025" DrawAspect="Content" ObjectID="_1837297851" r:id="rId8"/>
+          <o:OLEObject Type="Embed" ProgID="Visio.Drawing.15" ShapeID="_x0000_i1025" DrawAspect="Content" ObjectID="_1837342033" r:id="rId10"/>
         </w:object>
       </w:r>
     </w:p>
@@ -515,6 +597,192 @@
           <w:szCs w:val="24"/>
         </w:rPr>
       </w:pPr>
+      <w:r>
+        <w:rPr>
+          <w:rFonts w:ascii="標楷體" w:eastAsia="標楷體" w:hAnsi="標楷體" w:cs="Times New Roman"/>
+          <w:szCs w:val="24"/>
+        </w:rPr>
+        <w:lastRenderedPageBreak/>
+        <w:drawing>
+          <wp:inline distT="0" distB="0" distL="0" distR="0" wp14:anchorId="24873F02" wp14:editId="45822BF9">
+            <wp:extent cx="3897640" cy="2289947"/>
+            <wp:effectExtent l="0" t="0" r="7620" b="0"/>
+            <wp:docPr id="2" name="圖片 2"/>
+            <wp:cNvGraphicFramePr>
+              <a:graphicFrameLocks xmlns:a="http://schemas.openxmlformats.org/drawingml/2006/main" noChangeAspect="1"/>
+            </wp:cNvGraphicFramePr>
+            <a:graphic xmlns:a="http://schemas.openxmlformats.org/drawingml/2006/main">
+              <a:graphicData uri="http://schemas.openxmlformats.org/drawingml/2006/picture">
+                <pic:pic xmlns:pic="http://schemas.openxmlformats.org/drawingml/2006/picture">
+                  <pic:nvPicPr>
+                    <pic:cNvPr id="1" name=""/>
+                    <pic:cNvPicPr/>
+                  </pic:nvPicPr>
+                  <pic:blipFill>
+                    <a:blip r:embed="rId11"/>
+                    <a:stretch>
+                      <a:fillRect/>
+                    </a:stretch>
+                  </pic:blipFill>
+                  <pic:spPr>
+                    <a:xfrm>
+                      <a:off x="0" y="0"/>
+                      <a:ext cx="3898872" cy="2290671"/>
+                    </a:xfrm>
+                    <a:prstGeom prst="rect">
+                      <a:avLst/>
+                    </a:prstGeom>
+                  </pic:spPr>
+                </pic:pic>
+              </a:graphicData>
+            </a:graphic>
+          </wp:inline>
+        </w:drawing>
+      </w:r>
+    </w:p>
+    <w:p>
+      <w:pPr>
+        <w:pStyle w:val="a8"/>
+        <w:ind w:leftChars="0" w:left="1080"/>
+        <w:rPr>
+          <w:rFonts w:ascii="標楷體" w:eastAsia="標楷體" w:hAnsi="標楷體" w:cs="Times New Roman"/>
+          <w:szCs w:val="24"/>
+        </w:rPr>
+      </w:pPr>
+      <w:r>
+        <w:rPr>
+          <w:rFonts w:ascii="標楷體" w:eastAsia="標楷體" w:hAnsi="標楷體" w:cs="Times New Roman"/>
+          <w:szCs w:val="24"/>
+        </w:rPr>
+        <w:drawing>
+          <wp:inline distT="0" distB="0" distL="0" distR="0" wp14:anchorId="4218A1DB" wp14:editId="7810867D">
+            <wp:extent cx="3097840" cy="4444476"/>
+            <wp:effectExtent l="0" t="0" r="7620" b="0"/>
+            <wp:docPr id="3" name="圖片 3"/>
+            <wp:cNvGraphicFramePr>
+              <a:graphicFrameLocks xmlns:a="http://schemas.openxmlformats.org/drawingml/2006/main" noChangeAspect="1"/>
+            </wp:cNvGraphicFramePr>
+            <a:graphic xmlns:a="http://schemas.openxmlformats.org/drawingml/2006/main">
+              <a:graphicData uri="http://schemas.openxmlformats.org/drawingml/2006/picture">
+                <pic:pic xmlns:pic="http://schemas.openxmlformats.org/drawingml/2006/picture">
+                  <pic:nvPicPr>
+                    <pic:cNvPr id="1" name=""/>
+                    <pic:cNvPicPr/>
+                  </pic:nvPicPr>
+                  <pic:blipFill>
+                    <a:blip r:embed="rId12"/>
+                    <a:stretch>
+                      <a:fillRect/>
+                    </a:stretch>
+                  </pic:blipFill>
+                  <pic:spPr>
+                    <a:xfrm>
+                      <a:off x="0" y="0"/>
+                      <a:ext cx="3106275" cy="4456577"/>
+                    </a:xfrm>
+                    <a:prstGeom prst="rect">
+                      <a:avLst/>
+                    </a:prstGeom>
+                  </pic:spPr>
+                </pic:pic>
+              </a:graphicData>
+            </a:graphic>
+          </wp:inline>
+        </w:drawing>
+      </w:r>
+      <w:r>
+        <w:rPr>
+          <w:rFonts w:ascii="標楷體" w:eastAsia="標楷體" w:hAnsi="標楷體" w:cs="Times New Roman"/>
+          <w:szCs w:val="24"/>
+        </w:rPr>
+        <w:drawing>
+          <wp:inline distT="0" distB="0" distL="0" distR="0" wp14:anchorId="4AEBFC5A" wp14:editId="34089BB4">
+            <wp:extent cx="2617419" cy="4437981"/>
+            <wp:effectExtent l="0" t="0" r="0" b="1270"/>
+            <wp:docPr id="4" name="圖片 4"/>
+            <wp:cNvGraphicFramePr>
+              <a:graphicFrameLocks xmlns:a="http://schemas.openxmlformats.org/drawingml/2006/main" noChangeAspect="1"/>
+            </wp:cNvGraphicFramePr>
+            <a:graphic xmlns:a="http://schemas.openxmlformats.org/drawingml/2006/main">
+              <a:graphicData uri="http://schemas.openxmlformats.org/drawingml/2006/picture">
+                <pic:pic xmlns:pic="http://schemas.openxmlformats.org/drawingml/2006/picture">
+                  <pic:nvPicPr>
+                    <pic:cNvPr id="1" name=""/>
+                    <pic:cNvPicPr/>
+                  </pic:nvPicPr>
+                  <pic:blipFill>
+                    <a:blip r:embed="rId13"/>
+                    <a:stretch>
+                      <a:fillRect/>
+                    </a:stretch>
+                  </pic:blipFill>
+                  <pic:spPr>
+                    <a:xfrm>
+                      <a:off x="0" y="0"/>
+                      <a:ext cx="2623041" cy="4447514"/>
+                    </a:xfrm>
+                    <a:prstGeom prst="rect">
+                      <a:avLst/>
+                    </a:prstGeom>
+                  </pic:spPr>
+                </pic:pic>
+              </a:graphicData>
+            </a:graphic>
+          </wp:inline>
+        </w:drawing>
+      </w:r>
+    </w:p>
+    <w:p>
+      <w:pPr>
+        <w:pStyle w:val="a8"/>
+        <w:ind w:leftChars="0" w:left="1080"/>
+        <w:rPr>
+          <w:rFonts w:ascii="標楷體" w:eastAsia="標楷體" w:hAnsi="標楷體" w:cs="Times New Roman" w:hint="eastAsia"/>
+          <w:szCs w:val="24"/>
+        </w:rPr>
+      </w:pPr>
+      <w:r>
+        <w:rPr>
+          <w:rFonts w:ascii="標楷體" w:eastAsia="標楷體" w:hAnsi="標楷體" w:cs="Times New Roman"/>
+          <w:szCs w:val="24"/>
+        </w:rPr>
+        <w:lastRenderedPageBreak/>
+        <w:drawing>
+          <wp:inline distT="0" distB="0" distL="0" distR="0" wp14:anchorId="3F6CCAFE" wp14:editId="0D02B5B5">
+            <wp:extent cx="5890260" cy="4582314"/>
+            <wp:effectExtent l="0" t="0" r="0" b="8890"/>
+            <wp:docPr id="5" name="圖片 5"/>
+            <wp:cNvGraphicFramePr>
+              <a:graphicFrameLocks xmlns:a="http://schemas.openxmlformats.org/drawingml/2006/main" noChangeAspect="1"/>
+            </wp:cNvGraphicFramePr>
+            <a:graphic xmlns:a="http://schemas.openxmlformats.org/drawingml/2006/main">
+              <a:graphicData uri="http://schemas.openxmlformats.org/drawingml/2006/picture">
+                <pic:pic xmlns:pic="http://schemas.openxmlformats.org/drawingml/2006/picture">
+                  <pic:nvPicPr>
+                    <pic:cNvPr id="1" name=""/>
+                    <pic:cNvPicPr/>
+                  </pic:nvPicPr>
+                  <pic:blipFill>
+                    <a:blip r:embed="rId14"/>
+                    <a:stretch>
+                      <a:fillRect/>
+                    </a:stretch>
+                  </pic:blipFill>
+                  <pic:spPr>
+                    <a:xfrm>
+                      <a:off x="0" y="0"/>
+                      <a:ext cx="5894065" cy="4585274"/>
+                    </a:xfrm>
+                    <a:prstGeom prst="rect">
+                      <a:avLst/>
+                    </a:prstGeom>
+                  </pic:spPr>
+                </pic:pic>
+              </a:graphicData>
+            </a:graphic>
+          </wp:inline>
+        </w:drawing>
+      </w:r>
     </w:p>
     <w:p>
       <w:pPr>
@@ -580,6 +848,88 @@
           <w:szCs w:val="24"/>
         </w:rPr>
       </w:pPr>
+      <w:r>
+        <w:rPr>
+          <w:rFonts w:ascii="標楷體" w:eastAsia="標楷體" w:hAnsi="標楷體" w:cs="Times New Roman"/>
+          <w:szCs w:val="24"/>
+        </w:rPr>
+        <w:drawing>
+          <wp:inline distT="0" distB="0" distL="0" distR="0" wp14:anchorId="279D69EA" wp14:editId="5270BFFC">
+            <wp:extent cx="3545062" cy="2082800"/>
+            <wp:effectExtent l="0" t="0" r="0" b="0"/>
+            <wp:docPr id="6" name="圖片 6"/>
+            <wp:cNvGraphicFramePr>
+              <a:graphicFrameLocks xmlns:a="http://schemas.openxmlformats.org/drawingml/2006/main" noChangeAspect="1"/>
+            </wp:cNvGraphicFramePr>
+            <a:graphic xmlns:a="http://schemas.openxmlformats.org/drawingml/2006/main">
+              <a:graphicData uri="http://schemas.openxmlformats.org/drawingml/2006/picture">
+                <pic:pic xmlns:pic="http://schemas.openxmlformats.org/drawingml/2006/picture">
+                  <pic:nvPicPr>
+                    <pic:cNvPr id="1" name=""/>
+                    <pic:cNvPicPr/>
+                  </pic:nvPicPr>
+                  <pic:blipFill>
+                    <a:blip r:embed="rId15"/>
+                    <a:stretch>
+                      <a:fillRect/>
+                    </a:stretch>
+                  </pic:blipFill>
+                  <pic:spPr>
+                    <a:xfrm>
+                      <a:off x="0" y="0"/>
+                      <a:ext cx="3557994" cy="2090398"/>
+                    </a:xfrm>
+                    <a:prstGeom prst="rect">
+                      <a:avLst/>
+                    </a:prstGeom>
+                  </pic:spPr>
+                </pic:pic>
+              </a:graphicData>
+            </a:graphic>
+          </wp:inline>
+        </w:drawing>
+      </w:r>
+      <w:r>
+        <w:rPr>
+          <w:rFonts w:ascii="標楷體" w:eastAsia="標楷體" w:hAnsi="標楷體" w:cs="Times New Roman"/>
+          <w:szCs w:val="24"/>
+        </w:rPr>
+        <w:drawing>
+          <wp:inline distT="0" distB="0" distL="0" distR="0" wp14:anchorId="29640700" wp14:editId="63B032A7">
+            <wp:extent cx="5168900" cy="836131"/>
+            <wp:effectExtent l="0" t="0" r="0" b="2540"/>
+            <wp:docPr id="7" name="圖片 7"/>
+            <wp:cNvGraphicFramePr>
+              <a:graphicFrameLocks xmlns:a="http://schemas.openxmlformats.org/drawingml/2006/main" noChangeAspect="1"/>
+            </wp:cNvGraphicFramePr>
+            <a:graphic xmlns:a="http://schemas.openxmlformats.org/drawingml/2006/main">
+              <a:graphicData uri="http://schemas.openxmlformats.org/drawingml/2006/picture">
+                <pic:pic xmlns:pic="http://schemas.openxmlformats.org/drawingml/2006/picture">
+                  <pic:nvPicPr>
+                    <pic:cNvPr id="1" name=""/>
+                    <pic:cNvPicPr/>
+                  </pic:nvPicPr>
+                  <pic:blipFill>
+                    <a:blip r:embed="rId16"/>
+                    <a:stretch>
+                      <a:fillRect/>
+                    </a:stretch>
+                  </pic:blipFill>
+                  <pic:spPr>
+                    <a:xfrm>
+                      <a:off x="0" y="0"/>
+                      <a:ext cx="5181642" cy="838192"/>
+                    </a:xfrm>
+                    <a:prstGeom prst="rect">
+                      <a:avLst/>
+                    </a:prstGeom>
+                  </pic:spPr>
+                </pic:pic>
+              </a:graphicData>
+            </a:graphic>
+          </wp:inline>
+        </w:drawing>
+      </w:r>
     </w:p>
     <w:p>
       <w:pPr>
@@ -724,6 +1074,73 @@
           <w:bCs/>
         </w:rPr>
       </w:pPr>
+    </w:p>
+    <w:p>
+      <w:pPr>
+        <w:rPr>
+          <w:b/>
+          <w:bCs/>
+        </w:rPr>
+      </w:pPr>
+      <w:r>
+        <w:rPr>
+          <w:rFonts w:hint="eastAsia"/>
+          <w:b/>
+          <w:bCs/>
+        </w:rPr>
+        <w:lastRenderedPageBreak/>
+        <w:t>除錯紀錄：</w:t>
+      </w:r>
+    </w:p>
+    <w:p>
+      <w:pPr>
+        <w:rPr>
+          <w:rFonts w:hint="eastAsia"/>
+          <w:b/>
+          <w:bCs/>
+        </w:rPr>
+      </w:pPr>
+      <w:r>
+        <w:rPr>
+          <w:sz w:val="28"/>
+          <w:szCs w:val="28"/>
+        </w:rPr>
+        <w:drawing>
+          <wp:inline distT="0" distB="0" distL="0" distR="0" wp14:anchorId="30E883FA" wp14:editId="63E2CF27">
+            <wp:extent cx="6645910" cy="3904615"/>
+            <wp:effectExtent l="0" t="0" r="2540" b="635"/>
+            <wp:docPr id="1" name="圖片 1"/>
+            <wp:cNvGraphicFramePr>
+              <a:graphicFrameLocks xmlns:a="http://schemas.openxmlformats.org/drawingml/2006/main" noChangeAspect="1"/>
+            </wp:cNvGraphicFramePr>
+            <a:graphic xmlns:a="http://schemas.openxmlformats.org/drawingml/2006/main">
+              <a:graphicData uri="http://schemas.openxmlformats.org/drawingml/2006/picture">
+                <pic:pic xmlns:pic="http://schemas.openxmlformats.org/drawingml/2006/picture">
+                  <pic:nvPicPr>
+                    <pic:cNvPr id="1" name=""/>
+                    <pic:cNvPicPr/>
+                  </pic:nvPicPr>
+                  <pic:blipFill>
+                    <a:blip r:embed="rId17"/>
+                    <a:stretch>
+                      <a:fillRect/>
+                    </a:stretch>
+                  </pic:blipFill>
+                  <pic:spPr>
+                    <a:xfrm>
+                      <a:off x="0" y="0"/>
+                      <a:ext cx="6645910" cy="3904615"/>
+                    </a:xfrm>
+                    <a:prstGeom prst="rect">
+                      <a:avLst/>
+                    </a:prstGeom>
+                  </pic:spPr>
+                </pic:pic>
+              </a:graphicData>
+            </a:graphic>
+          </wp:inline>
+        </w:drawing>
+      </w:r>
     </w:p>
     <w:sectPr>
       <w:pgSz w:w="11906" w:h="16838"/>

</xml_diff>